<commit_message>
Adicionando cartão e comentário ao uso de IA
</commit_message>
<xml_diff>
--- a/T1_Template_Spot-Check_Summary.docx
+++ b/T1_Template_Spot-Check_Summary.docx
@@ -184,8 +184,12 @@
             </w:pPr>
             <w:r>
               <w:rPr>
-                <w:rtl w:val="0"/>
-              </w:rPr>
+                <w:rFonts w:ascii="Arial" w:cs="Arial" w:eastAsia="Arial" w:hAnsi="Arial"/>
+                <w:sz w:val="22"/>
+                <w:szCs w:val="22"/>
+                <w:rtl w:val="0"/>
+              </w:rPr>
+              <w:t xml:space="preserve">00275602</w:t>
             </w:r>
           </w:p>
         </w:tc>
@@ -384,7 +388,7 @@
           <w:szCs w:val="22"/>
         </w:rPr>
       </w:pPr>
-      <w:bookmarkStart w:colFirst="0" w:colLast="0" w:name="_adzpuhenarcl" w:id="0"/>
+      <w:bookmarkStart w:colFirst="0" w:colLast="0" w:name="_1gb9cdi8emeg" w:id="0"/>
       <w:bookmarkEnd w:id="0"/>
       <w:r>
         <w:rPr>
@@ -4253,7 +4257,7 @@
           <w:szCs w:val="22"/>
           <w:rtl w:val="0"/>
         </w:rPr>
-        <w:t xml:space="preserve">O grupo utilizou o assistente Claude (Anthropic), por meio do Claude Code, como apoio na revisão do código e da metodologia. Ele ajudou a identificar problemas como a ordem entre padronização e SMOTE, a codificação de atributos categóricos armazenados como inteiros e a incompatibilidade com o pandas 3, e sugeriu alternativas como o SMOTENC. Também foi usado na conversão do script para notebook e na redação de rascunhos deste relatório. Todas as sugestões foram revisadas, testadas e validadas pelo grupo, que compreende e é capaz de justificar as decisões e os resultados apresentados.</w:t>
+        <w:t xml:space="preserve">O grupo utilizou o assistente Claude (Anthropic), por meio do Claude Code, como apoio na escrita e revisão do código e da metodologia. Ele ajudou a identificar problemas como a ordem entre padronização e SMOTE, a codificação de atributos categóricos armazenados como inteiros e a incompatibilidade com o pandas 3, e sugeriu alternativas como o SMOTENC. Também foi usado na conversão do script para notebook e na redação de rascunhos deste relatório. Todas as sugestões foram revisadas, testadas e validadas pelo grupo, que compreende e é capaz de justificar as decisões e os resultados apresentados.</w:t>
       </w:r>
     </w:p>
     <w:p>
@@ -4266,7 +4270,7 @@
           <w:szCs w:val="22"/>
         </w:rPr>
       </w:pPr>
-      <w:bookmarkStart w:colFirst="0" w:colLast="0" w:name="_ebgt2gsr61gv" w:id="1"/>
+      <w:bookmarkStart w:colFirst="0" w:colLast="0" w:name="_xnqs5q4h5nj" w:id="1"/>
       <w:bookmarkEnd w:id="1"/>
       <w:r>
         <w:rPr>

</xml_diff>